<commit_message>
Correct overlap and metric wording; trim report and literature table
- Overlap: state that identical-feature twins limit Analysis and Backdoor
  but do not explain the whole gap (memorising rule reaches ~F1 0.36,
  models reach ~0.17); add train and test twin shares
- Metrics: name which GNN papers report weighted vs macro F1; limit the
  "weighted F1 ~0.98" statement to the models it was checked for
- Remove unverifiable claims (Xie et al., a published GNN score of 0.36-0.41)
- Report: drop the oversampling-method and merged-class sections, renumber
- Literature table: drop 4 abstract-only papers (14 remain), renumber
  P1-P14, remove the suggested-wording section
- README: update paper count
</commit_message>
<xml_diff>
--- a/Our_Work/documents/UNSW-NB15-Literature-Comparison.docx
+++ b/Our_Work/documents/UNSW-NB15-Literature-Comparison.docx
@@ -428,7 +428,7 @@
               <w:rPr>
                 <w:sz w:val="18"/>
               </w:rPr>
-              <w:t>Analysis and Backdoor stay low largely because many of their rows have an exact feature twin with another label.</w:t>
+              <w:t>Analysis and Backdoor stay low. Many of their rows have an exact feature twin with another label, which lowers the achievable score but does not explain all of it.</w:t>
             </w:r>
           </w:p>
         </w:tc>
@@ -445,7 +445,7 @@
               <w:rPr>
                 <w:sz w:val="18"/>
               </w:rPr>
-              <w:t>Share of rows with a twin of another label: Backdoor 81.6%, Analysis 78.3%. F1: Backdoor 0.179, Analysis 0.172.</w:t>
+              <w:t>Training rows with a twin of another label (45 model features): Backdoor 82.5%, Analysis 78.2%. A rule that memorises the most common label of each identical-feature group reaches F1 0.36 (Backdoor) and 0.37 (Analysis) on the training data; our models reach 0.179 and 0.172.</w:t>
             </w:r>
           </w:p>
         </w:tc>
@@ -1380,7 +1380,7 @@
               <w:rPr>
                 <w:sz w:val="15"/>
               </w:rPr>
-              <w:t>Sarhan, Layeghy, Portmann (2021). Towards a Standard Feature Set for Network Intrusion Detection System Datasets.</w:t>
+              <w:t>Zoghi &amp; Serpen (2024). Building an intrusion detection system on UNSW-NB15: reducing the margin of error to deal with data overlap and imbalance. Concurrency and Computation: Practice and Experience.</w:t>
             </w:r>
           </w:p>
         </w:tc>
@@ -1393,163 +1393,6 @@
               <w:spacing w:after="0"/>
             </w:pPr>
             <w:hyperlink r:id="rId11">
-              <w:r>
-                <w:rPr>
-                  <w:color w:val="0563C1"/>
-                  <w:u w:val="single"/>
-                  <w:sz w:val="15"/>
-                </w:rPr>
-                <w:t>https://arxiv.org/abs/2101.11315</w:t>
-              </w:r>
-            </w:hyperlink>
-          </w:p>
-        </w:tc>
-        <w:tc>
-          <w:tcPr>
-            <w:tcW w:type="dxa" w:w="964"/>
-          </w:tcPr>
-          <w:p>
-            <w:pPr>
-              <w:spacing w:after="0"/>
-            </w:pPr>
-            <w:r>
-              <w:rPr>
-                <w:sz w:val="15"/>
-              </w:rPr>
-              <w:t>Dataset / feature sets</w:t>
-            </w:r>
-          </w:p>
-        </w:tc>
-        <w:tc>
-          <w:tcPr>
-            <w:tcW w:type="dxa" w:w="1757"/>
-          </w:tcPr>
-          <w:p>
-            <w:pPr>
-              <w:spacing w:after="0"/>
-            </w:pPr>
-            <w:r>
-              <w:rPr>
-                <w:sz w:val="15"/>
-              </w:rPr>
-              <w:t>Several NIDS datasets (list not checked).</w:t>
-            </w:r>
-          </w:p>
-        </w:tc>
-        <w:tc>
-          <w:tcPr>
-            <w:tcW w:type="dxa" w:w="1701"/>
-          </w:tcPr>
-          <w:p>
-            <w:pPr>
-              <w:spacing w:after="0"/>
-            </w:pPr>
-            <w:r>
-              <w:rPr>
-                <w:sz w:val="15"/>
-              </w:rPr>
-              <w:t>Not checked.</w:t>
-            </w:r>
-          </w:p>
-        </w:tc>
-        <w:tc>
-          <w:tcPr>
-            <w:tcW w:type="dxa" w:w="2438"/>
-          </w:tcPr>
-          <w:p>
-            <w:pPr>
-              <w:spacing w:after="0"/>
-            </w:pPr>
-            <w:r>
-              <w:rPr>
-                <w:sz w:val="15"/>
-              </w:rPr>
-              <w:t>Proposes two NetFlow-based feature sets (12 and 43 features) so datasets can be compared.</w:t>
-            </w:r>
-          </w:p>
-        </w:tc>
-        <w:tc>
-          <w:tcPr>
-            <w:tcW w:type="dxa" w:w="2494"/>
-          </w:tcPr>
-          <w:p>
-            <w:pPr>
-              <w:spacing w:after="0"/>
-            </w:pPr>
-            <w:r>
-              <w:rPr>
-                <w:sz w:val="15"/>
-              </w:rPr>
-              <w:t>Not checked. The abstract argues that dataset-specific features make performance comparison 'virtually impossible'.</w:t>
-            </w:r>
-          </w:p>
-        </w:tc>
-        <w:tc>
-          <w:tcPr>
-            <w:tcW w:type="dxa" w:w="1134"/>
-          </w:tcPr>
-          <w:p>
-            <w:pPr>
-              <w:spacing w:after="0"/>
-            </w:pPr>
-            <w:r>
-              <w:rPr>
-                <w:sz w:val="15"/>
-              </w:rPr>
-              <w:t>Abstract only (abstract)</w:t>
-            </w:r>
-          </w:p>
-        </w:tc>
-      </w:tr>
-      <w:tr>
-        <w:trPr>
-          <w:cantSplit w:val="true"/>
-        </w:trPr>
-        <w:tc>
-          <w:tcPr>
-            <w:tcW w:type="dxa" w:w="510"/>
-            <w:shd w:val="clear" w:color="auto" w:fill="F2F5F9"/>
-          </w:tcPr>
-          <w:p>
-            <w:pPr>
-              <w:spacing w:after="0"/>
-            </w:pPr>
-            <w:r>
-              <w:rPr>
-                <w:b/>
-                <w:sz w:val="15"/>
-              </w:rPr>
-              <w:t>P4</w:t>
-            </w:r>
-          </w:p>
-        </w:tc>
-        <w:tc>
-          <w:tcPr>
-            <w:tcW w:type="dxa" w:w="2324"/>
-            <w:shd w:val="clear" w:color="auto" w:fill="F2F5F9"/>
-          </w:tcPr>
-          <w:p>
-            <w:pPr>
-              <w:spacing w:after="0"/>
-            </w:pPr>
-            <w:r>
-              <w:rPr>
-                <w:sz w:val="15"/>
-              </w:rPr>
-              <w:t>Zoghi &amp; Serpen (2024). Building an intrusion detection system on UNSW-NB15: reducing the margin of error to deal with data overlap and imbalance. Concurrency and Computation: Practice and Experience.</w:t>
-            </w:r>
-          </w:p>
-        </w:tc>
-        <w:tc>
-          <w:tcPr>
-            <w:tcW w:type="dxa" w:w="1814"/>
-            <w:shd w:val="clear" w:color="auto" w:fill="F2F5F9"/>
-          </w:tcPr>
-          <w:p>
-            <w:pPr>
-              <w:spacing w:after="0"/>
-            </w:pPr>
-            <w:hyperlink r:id="rId12">
               <w:r>
                 <w:rPr>
                   <w:color w:val="0563C1"/>
@@ -1564,7 +1407,6 @@
         <w:tc>
           <w:tcPr>
             <w:tcW w:type="dxa" w:w="964"/>
-            <w:shd w:val="clear" w:color="auto" w:fill="F2F5F9"/>
           </w:tcPr>
           <w:p>
             <w:pPr>
@@ -1581,7 +1423,6 @@
         <w:tc>
           <w:tcPr>
             <w:tcW w:type="dxa" w:w="1757"/>
-            <w:shd w:val="clear" w:color="auto" w:fill="F2F5F9"/>
           </w:tcPr>
           <w:p>
             <w:pPr>
@@ -1598,7 +1439,6 @@
         <w:tc>
           <w:tcPr>
             <w:tcW w:type="dxa" w:w="1701"/>
-            <w:shd w:val="clear" w:color="auto" w:fill="F2F5F9"/>
           </w:tcPr>
           <w:p>
             <w:pPr>
@@ -1615,7 +1455,6 @@
         <w:tc>
           <w:tcPr>
             <w:tcW w:type="dxa" w:w="2438"/>
-            <w:shd w:val="clear" w:color="auto" w:fill="F2F5F9"/>
           </w:tcPr>
           <w:p>
             <w:pPr>
@@ -1632,7 +1471,6 @@
         <w:tc>
           <w:tcPr>
             <w:tcW w:type="dxa" w:w="2494"/>
-            <w:shd w:val="clear" w:color="auto" w:fill="F2F5F9"/>
           </w:tcPr>
           <w:p>
             <w:pPr>
@@ -1649,7 +1487,6 @@
         <w:tc>
           <w:tcPr>
             <w:tcW w:type="dxa" w:w="1134"/>
-            <w:shd w:val="clear" w:color="auto" w:fill="F2F5F9"/>
           </w:tcPr>
           <w:p>
             <w:pPr>
@@ -1671,6 +1508,7 @@
         <w:tc>
           <w:tcPr>
             <w:tcW w:type="dxa" w:w="510"/>
+            <w:shd w:val="clear" w:color="auto" w:fill="F2F5F9"/>
           </w:tcPr>
           <w:p>
             <w:pPr>
@@ -1681,162 +1519,7 @@
                 <w:b/>
                 <w:sz w:val="15"/>
               </w:rPr>
-              <w:t>P5</w:t>
-            </w:r>
-          </w:p>
-        </w:tc>
-        <w:tc>
-          <w:tcPr>
-            <w:tcW w:type="dxa" w:w="2324"/>
-          </w:tcPr>
-          <w:p>
-            <w:pPr>
-              <w:spacing w:after="0"/>
-            </w:pPr>
-            <w:r>
-              <w:rPr>
-                <w:sz w:val="15"/>
-              </w:rPr>
-              <w:t>Kasongo &amp; Sun (2020). Performance analysis of intrusion detection systems using a feature selection method on the UNSW-NB15 dataset. Journal of Big Data 7.</w:t>
-            </w:r>
-          </w:p>
-        </w:tc>
-        <w:tc>
-          <w:tcPr>
-            <w:tcW w:type="dxa" w:w="1814"/>
-          </w:tcPr>
-          <w:p>
-            <w:pPr>
-              <w:spacing w:after="0"/>
-            </w:pPr>
-            <w:hyperlink r:id="rId13">
-              <w:r>
-                <w:rPr>
-                  <w:color w:val="0563C1"/>
-                  <w:u w:val="single"/>
-                  <w:sz w:val="15"/>
-                </w:rPr>
-                <w:t>https://doi.org/10.1186/s40537-020-00379-6</w:t>
-              </w:r>
-            </w:hyperlink>
-          </w:p>
-        </w:tc>
-        <w:tc>
-          <w:tcPr>
-            <w:tcW w:type="dxa" w:w="964"/>
-          </w:tcPr>
-          <w:p>
-            <w:pPr>
-              <w:spacing w:after="0"/>
-            </w:pPr>
-            <w:r>
-              <w:rPr>
-                <w:sz w:val="15"/>
-              </w:rPr>
-              <w:t>Tabular ML</w:t>
-            </w:r>
-          </w:p>
-        </w:tc>
-        <w:tc>
-          <w:tcPr>
-            <w:tcW w:type="dxa" w:w="1757"/>
-          </w:tcPr>
-          <w:p>
-            <w:pPr>
-              <w:spacing w:after="0"/>
-            </w:pPr>
-            <w:r>
-              <w:rPr>
-                <w:sz w:val="15"/>
-              </w:rPr>
-              <w:t>UNSW-NB15.</w:t>
-            </w:r>
-          </w:p>
-        </w:tc>
-        <w:tc>
-          <w:tcPr>
-            <w:tcW w:type="dxa" w:w="1701"/>
-          </w:tcPr>
-          <w:p>
-            <w:pPr>
-              <w:spacing w:after="0"/>
-            </w:pPr>
-            <w:r>
-              <w:rPr>
-                <w:sz w:val="15"/>
-              </w:rPr>
-              <w:t>Not checked.</w:t>
-            </w:r>
-          </w:p>
-        </w:tc>
-        <w:tc>
-          <w:tcPr>
-            <w:tcW w:type="dxa" w:w="2438"/>
-          </w:tcPr>
-          <w:p>
-            <w:pPr>
-              <w:spacing w:after="0"/>
-            </w:pPr>
-            <w:r>
-              <w:rPr>
-                <w:sz w:val="15"/>
-              </w:rPr>
-              <w:t>XGBoost-based filter feature selection, then DT, ANN, LR, KNN and SVM classifiers.</w:t>
-            </w:r>
-          </w:p>
-        </w:tc>
-        <w:tc>
-          <w:tcPr>
-            <w:tcW w:type="dxa" w:w="2494"/>
-          </w:tcPr>
-          <w:p>
-            <w:pPr>
-              <w:spacing w:after="0"/>
-            </w:pPr>
-            <w:r>
-              <w:rPr>
-                <w:sz w:val="15"/>
-              </w:rPr>
-              <w:t>Not checked.</w:t>
-            </w:r>
-          </w:p>
-        </w:tc>
-        <w:tc>
-          <w:tcPr>
-            <w:tcW w:type="dxa" w:w="1134"/>
-          </w:tcPr>
-          <w:p>
-            <w:pPr>
-              <w:spacing w:after="0"/>
-            </w:pPr>
-            <w:r>
-              <w:rPr>
-                <w:sz w:val="15"/>
-              </w:rPr>
-              <w:t>Abstract only (search summary)</w:t>
-            </w:r>
-          </w:p>
-        </w:tc>
-      </w:tr>
-      <w:tr>
-        <w:trPr>
-          <w:cantSplit w:val="true"/>
-        </w:trPr>
-        <w:tc>
-          <w:tcPr>
-            <w:tcW w:type="dxa" w:w="510"/>
-            <w:shd w:val="clear" w:color="auto" w:fill="F2F5F9"/>
-          </w:tcPr>
-          <w:p>
-            <w:pPr>
-              <w:spacing w:after="0"/>
-            </w:pPr>
-            <w:r>
-              <w:rPr>
-                <w:b/>
-                <w:sz w:val="15"/>
-              </w:rPr>
-              <w:t>P6</w:t>
+              <w:t>P4</w:t>
             </w:r>
           </w:p>
         </w:tc>
@@ -1866,7 +1549,7 @@
             <w:pPr>
               <w:spacing w:after="0"/>
             </w:pPr>
-            <w:hyperlink r:id="rId14">
+            <w:hyperlink r:id="rId12">
               <w:r>
                 <w:rPr>
                   <w:color w:val="0563C1"/>
@@ -1998,7 +1681,7 @@
                 <w:b/>
                 <w:sz w:val="15"/>
               </w:rPr>
-              <w:t>P7</w:t>
+              <w:t>P5</w:t>
             </w:r>
           </w:p>
         </w:tc>
@@ -2026,7 +1709,7 @@
             <w:pPr>
               <w:spacing w:after="0"/>
             </w:pPr>
-            <w:hyperlink r:id="rId15">
+            <w:hyperlink r:id="rId13">
               <w:r>
                 <w:rPr>
                   <w:color w:val="0563C1"/>
@@ -2153,7 +1836,7 @@
                 <w:b/>
                 <w:sz w:val="15"/>
               </w:rPr>
-              <w:t>P8</w:t>
+              <w:t>P6</w:t>
             </w:r>
           </w:p>
         </w:tc>
@@ -2183,7 +1866,7 @@
             <w:pPr>
               <w:spacing w:after="0"/>
             </w:pPr>
-            <w:hyperlink r:id="rId16">
+            <w:hyperlink r:id="rId14">
               <w:r>
                 <w:rPr>
                   <w:color w:val="0563C1"/>
@@ -2315,7 +1998,7 @@
                 <w:b/>
                 <w:sz w:val="15"/>
               </w:rPr>
-              <w:t>P9</w:t>
+              <w:t>P7</w:t>
             </w:r>
           </w:p>
         </w:tc>
@@ -2331,7 +2014,7 @@
               <w:rPr>
                 <w:sz w:val="15"/>
               </w:rPr>
-              <w:t>Bilot, El Madhoun, Al Agha, Zouaoui (2023). Graph Neural Networks for Intrusion Detection: A Survey. IEEE Access 11, 49114-49139.</w:t>
+              <w:t>Wang, Zheng, Gui, Hua, Hassan (2025). Are We There Yet? Unraveling the State-of-the-Art Graph Network Intrusion Detection Systems.</w:t>
             </w:r>
           </w:p>
         </w:tc>
@@ -2343,324 +2026,7 @@
             <w:pPr>
               <w:spacing w:after="0"/>
             </w:pPr>
-            <w:hyperlink r:id="rId17">
-              <w:r>
-                <w:rPr>
-                  <w:color w:val="0563C1"/>
-                  <w:u w:val="single"/>
-                  <w:sz w:val="15"/>
-                </w:rPr>
-                <w:t>https://doi.org/10.1109/ACCESS.2023.3275789</w:t>
-              </w:r>
-            </w:hyperlink>
-          </w:p>
-        </w:tc>
-        <w:tc>
-          <w:tcPr>
-            <w:tcW w:type="dxa" w:w="964"/>
-          </w:tcPr>
-          <w:p>
-            <w:pPr>
-              <w:spacing w:after="0"/>
-            </w:pPr>
-            <w:r>
-              <w:rPr>
-                <w:sz w:val="15"/>
-              </w:rPr>
-              <w:t>Survey</w:t>
-            </w:r>
-          </w:p>
-        </w:tc>
-        <w:tc>
-          <w:tcPr>
-            <w:tcW w:type="dxa" w:w="1757"/>
-          </w:tcPr>
-          <w:p>
-            <w:pPr>
-              <w:spacing w:after="0"/>
-            </w:pPr>
-            <w:r>
-              <w:rPr>
-                <w:sz w:val="15"/>
-              </w:rPr>
-              <w:t>Survey (not applicable).</w:t>
-            </w:r>
-          </w:p>
-        </w:tc>
-        <w:tc>
-          <w:tcPr>
-            <w:tcW w:type="dxa" w:w="1701"/>
-          </w:tcPr>
-          <w:p>
-            <w:pPr>
-              <w:spacing w:after="0"/>
-            </w:pPr>
-            <w:r>
-              <w:rPr>
-                <w:sz w:val="15"/>
-              </w:rPr>
-              <w:t>Not applicable.</w:t>
-            </w:r>
-          </w:p>
-        </w:tc>
-        <w:tc>
-          <w:tcPr>
-            <w:tcW w:type="dxa" w:w="2438"/>
-          </w:tcPr>
-          <w:p>
-            <w:pPr>
-              <w:spacing w:after="0"/>
-            </w:pPr>
-            <w:r>
-              <w:rPr>
-                <w:sz w:val="15"/>
-              </w:rPr>
-              <w:t>Reviews graph representation learning for network-based and host-based intrusion detection.</w:t>
-            </w:r>
-          </w:p>
-        </w:tc>
-        <w:tc>
-          <w:tcPr>
-            <w:tcW w:type="dxa" w:w="2494"/>
-          </w:tcPr>
-          <w:p>
-            <w:pPr>
-              <w:spacing w:after="0"/>
-            </w:pPr>
-            <w:r>
-              <w:rPr>
-                <w:sz w:val="15"/>
-              </w:rPr>
-              <w:t>Not applicable.</w:t>
-            </w:r>
-          </w:p>
-        </w:tc>
-        <w:tc>
-          <w:tcPr>
-            <w:tcW w:type="dxa" w:w="1134"/>
-          </w:tcPr>
-          <w:p>
-            <w:pPr>
-              <w:spacing w:after="0"/>
-            </w:pPr>
-            <w:r>
-              <w:rPr>
-                <w:sz w:val="15"/>
-              </w:rPr>
-              <w:t>Abstract only (abstract)</w:t>
-            </w:r>
-          </w:p>
-        </w:tc>
-      </w:tr>
-      <w:tr>
-        <w:trPr>
-          <w:cantSplit w:val="true"/>
-        </w:trPr>
-        <w:tc>
-          <w:tcPr>
-            <w:tcW w:type="dxa" w:w="510"/>
-            <w:shd w:val="clear" w:color="auto" w:fill="F2F5F9"/>
-          </w:tcPr>
-          <w:p>
-            <w:pPr>
-              <w:spacing w:after="0"/>
-            </w:pPr>
-            <w:r>
-              <w:rPr>
-                <w:b/>
-                <w:sz w:val="15"/>
-              </w:rPr>
-              <w:t>P10</w:t>
-            </w:r>
-          </w:p>
-        </w:tc>
-        <w:tc>
-          <w:tcPr>
-            <w:tcW w:type="dxa" w:w="2324"/>
-            <w:shd w:val="clear" w:color="auto" w:fill="F2F5F9"/>
-          </w:tcPr>
-          <w:p>
-            <w:pPr>
-              <w:spacing w:after="0"/>
-            </w:pPr>
-            <w:r>
-              <w:rPr>
-                <w:sz w:val="15"/>
-              </w:rPr>
-              <w:t>Zhong, Lin, Zhang, Xu (2024). A survey on graph neural networks for intrusion detection systems: methods, trends and challenges. Computers &amp; Security 141.</w:t>
-            </w:r>
-          </w:p>
-        </w:tc>
-        <w:tc>
-          <w:tcPr>
-            <w:tcW w:type="dxa" w:w="1814"/>
-            <w:shd w:val="clear" w:color="auto" w:fill="F2F5F9"/>
-          </w:tcPr>
-          <w:p>
-            <w:pPr>
-              <w:spacing w:after="0"/>
-            </w:pPr>
-            <w:hyperlink r:id="rId18">
-              <w:r>
-                <w:rPr>
-                  <w:color w:val="0563C1"/>
-                  <w:u w:val="single"/>
-                  <w:sz w:val="15"/>
-                </w:rPr>
-                <w:t>https://doi.org/10.1016/j.cose.2024.103821</w:t>
-              </w:r>
-            </w:hyperlink>
-          </w:p>
-        </w:tc>
-        <w:tc>
-          <w:tcPr>
-            <w:tcW w:type="dxa" w:w="964"/>
-            <w:shd w:val="clear" w:color="auto" w:fill="F2F5F9"/>
-          </w:tcPr>
-          <w:p>
-            <w:pPr>
-              <w:spacing w:after="0"/>
-            </w:pPr>
-            <w:r>
-              <w:rPr>
-                <w:sz w:val="15"/>
-              </w:rPr>
-              <w:t>Survey</w:t>
-            </w:r>
-          </w:p>
-        </w:tc>
-        <w:tc>
-          <w:tcPr>
-            <w:tcW w:type="dxa" w:w="1757"/>
-            <w:shd w:val="clear" w:color="auto" w:fill="F2F5F9"/>
-          </w:tcPr>
-          <w:p>
-            <w:pPr>
-              <w:spacing w:after="0"/>
-            </w:pPr>
-            <w:r>
-              <w:rPr>
-                <w:sz w:val="15"/>
-              </w:rPr>
-              <w:t>Survey (not applicable).</w:t>
-            </w:r>
-          </w:p>
-        </w:tc>
-        <w:tc>
-          <w:tcPr>
-            <w:tcW w:type="dxa" w:w="1701"/>
-            <w:shd w:val="clear" w:color="auto" w:fill="F2F5F9"/>
-          </w:tcPr>
-          <w:p>
-            <w:pPr>
-              <w:spacing w:after="0"/>
-            </w:pPr>
-            <w:r>
-              <w:rPr>
-                <w:sz w:val="15"/>
-              </w:rPr>
-              <w:t>Not applicable.</w:t>
-            </w:r>
-          </w:p>
-        </w:tc>
-        <w:tc>
-          <w:tcPr>
-            <w:tcW w:type="dxa" w:w="2438"/>
-            <w:shd w:val="clear" w:color="auto" w:fill="F2F5F9"/>
-          </w:tcPr>
-          <w:p>
-            <w:pPr>
-              <w:spacing w:after="0"/>
-            </w:pPr>
-            <w:r>
-              <w:rPr>
-                <w:sz w:val="15"/>
-              </w:rPr>
-              <w:t>Reviews GNN methods for intrusion detection.</w:t>
-            </w:r>
-          </w:p>
-        </w:tc>
-        <w:tc>
-          <w:tcPr>
-            <w:tcW w:type="dxa" w:w="2494"/>
-            <w:shd w:val="clear" w:color="auto" w:fill="F2F5F9"/>
-          </w:tcPr>
-          <w:p>
-            <w:pPr>
-              <w:spacing w:after="0"/>
-            </w:pPr>
-            <w:r>
-              <w:rPr>
-                <w:sz w:val="15"/>
-              </w:rPr>
-              <w:t>Not applicable.</w:t>
-            </w:r>
-          </w:p>
-        </w:tc>
-        <w:tc>
-          <w:tcPr>
-            <w:tcW w:type="dxa" w:w="1134"/>
-            <w:shd w:val="clear" w:color="auto" w:fill="F2F5F9"/>
-          </w:tcPr>
-          <w:p>
-            <w:pPr>
-              <w:spacing w:after="0"/>
-            </w:pPr>
-            <w:r>
-              <w:rPr>
-                <w:sz w:val="15"/>
-              </w:rPr>
-              <w:t>Abstract only (abstract)</w:t>
-            </w:r>
-          </w:p>
-        </w:tc>
-      </w:tr>
-      <w:tr>
-        <w:trPr>
-          <w:cantSplit w:val="true"/>
-        </w:trPr>
-        <w:tc>
-          <w:tcPr>
-            <w:tcW w:type="dxa" w:w="510"/>
-          </w:tcPr>
-          <w:p>
-            <w:pPr>
-              <w:spacing w:after="0"/>
-            </w:pPr>
-            <w:r>
-              <w:rPr>
-                <w:b/>
-                <w:sz w:val="15"/>
-              </w:rPr>
-              <w:t>P11</w:t>
-            </w:r>
-          </w:p>
-        </w:tc>
-        <w:tc>
-          <w:tcPr>
-            <w:tcW w:type="dxa" w:w="2324"/>
-          </w:tcPr>
-          <w:p>
-            <w:pPr>
-              <w:spacing w:after="0"/>
-            </w:pPr>
-            <w:r>
-              <w:rPr>
-                <w:sz w:val="15"/>
-              </w:rPr>
-              <w:t>Wang, Zheng, Gui, Hua, Hassan (2025). Are We There Yet? Unraveling the State-of-the-Art Graph Network Intrusion Detection Systems.</w:t>
-            </w:r>
-          </w:p>
-        </w:tc>
-        <w:tc>
-          <w:tcPr>
-            <w:tcW w:type="dxa" w:w="1814"/>
-          </w:tcPr>
-          <w:p>
-            <w:pPr>
-              <w:spacing w:after="0"/>
-            </w:pPr>
-            <w:hyperlink r:id="rId19">
+            <w:hyperlink r:id="rId15">
               <w:r>
                 <w:rPr>
                   <w:color w:val="0563C1"/>
@@ -2787,7 +2153,7 @@
                 <w:b/>
                 <w:sz w:val="15"/>
               </w:rPr>
-              <w:t>P12</w:t>
+              <w:t>P8</w:t>
             </w:r>
           </w:p>
         </w:tc>
@@ -2817,7 +2183,7 @@
             <w:pPr>
               <w:spacing w:after="0"/>
             </w:pPr>
-            <w:hyperlink r:id="rId20">
+            <w:hyperlink r:id="rId16">
               <w:r>
                 <w:rPr>
                   <w:color w:val="0563C1"/>
@@ -2949,7 +2315,7 @@
                 <w:b/>
                 <w:sz w:val="15"/>
               </w:rPr>
-              <w:t>P13</w:t>
+              <w:t>P9</w:t>
             </w:r>
           </w:p>
         </w:tc>
@@ -2977,7 +2343,7 @@
             <w:pPr>
               <w:spacing w:after="0"/>
             </w:pPr>
-            <w:hyperlink r:id="rId21">
+            <w:hyperlink r:id="rId17">
               <w:r>
                 <w:rPr>
                   <w:color w:val="0563C1"/>
@@ -3104,7 +2470,7 @@
                 <w:b/>
                 <w:sz w:val="15"/>
               </w:rPr>
-              <w:t>P14</w:t>
+              <w:t>P10</w:t>
             </w:r>
           </w:p>
         </w:tc>
@@ -3134,7 +2500,7 @@
             <w:pPr>
               <w:spacing w:after="0"/>
             </w:pPr>
-            <w:hyperlink r:id="rId22">
+            <w:hyperlink r:id="rId18">
               <w:r>
                 <w:rPr>
                   <w:color w:val="0563C1"/>
@@ -3266,7 +2632,7 @@
                 <w:b/>
                 <w:sz w:val="15"/>
               </w:rPr>
-              <w:t>P15</w:t>
+              <w:t>P11</w:t>
             </w:r>
           </w:p>
         </w:tc>
@@ -3294,7 +2660,7 @@
             <w:pPr>
               <w:spacing w:after="0"/>
             </w:pPr>
-            <w:hyperlink r:id="rId23">
+            <w:hyperlink r:id="rId19">
               <w:r>
                 <w:rPr>
                   <w:color w:val="0563C1"/>
@@ -3421,7 +2787,7 @@
                 <w:b/>
                 <w:sz w:val="15"/>
               </w:rPr>
-              <w:t>P16</w:t>
+              <w:t>P12</w:t>
             </w:r>
           </w:p>
         </w:tc>
@@ -3451,7 +2817,7 @@
             <w:pPr>
               <w:spacing w:after="0"/>
             </w:pPr>
-            <w:hyperlink r:id="rId24">
+            <w:hyperlink r:id="rId20">
               <w:r>
                 <w:rPr>
                   <w:color w:val="0563C1"/>
@@ -3583,7 +2949,7 @@
                 <w:b/>
                 <w:sz w:val="15"/>
               </w:rPr>
-              <w:t>P17</w:t>
+              <w:t>P13</w:t>
             </w:r>
           </w:p>
         </w:tc>
@@ -3611,7 +2977,7 @@
             <w:pPr>
               <w:spacing w:after="0"/>
             </w:pPr>
-            <w:hyperlink r:id="rId25">
+            <w:hyperlink r:id="rId21">
               <w:r>
                 <w:rPr>
                   <w:color w:val="0563C1"/>
@@ -3738,7 +3104,7 @@
                 <w:b/>
                 <w:sz w:val="15"/>
               </w:rPr>
-              <w:t>P18</w:t>
+              <w:t>P14</w:t>
             </w:r>
           </w:p>
         </w:tc>
@@ -3768,7 +3134,7 @@
             <w:pPr>
               <w:spacing w:after="0"/>
             </w:pPr>
-            <w:hyperlink r:id="rId26">
+            <w:hyperlink r:id="rId22">
               <w:r>
                 <w:rPr>
                   <w:color w:val="0563C1"/>
@@ -4318,7 +3684,7 @@
               <w:rPr>
                 <w:sz w:val="16"/>
               </w:rPr>
-              <w:t>Sarhan et al. 2021</w:t>
+              <w:t>Zoghi &amp; Serpen 2024</w:t>
             </w:r>
           </w:p>
         </w:tc>
@@ -4334,7 +3700,7 @@
               <w:rPr>
                 <w:sz w:val="16"/>
               </w:rPr>
-              <w:t>Probably</w:t>
+              <w:t>Yes</w:t>
             </w:r>
           </w:p>
         </w:tc>
@@ -4350,7 +3716,7 @@
               <w:rPr>
                 <w:sz w:val="16"/>
               </w:rPr>
-              <w:t>No</w:t>
+              <w:t>Binary and multi-class; accuracy and sensitivity</w:t>
             </w:r>
           </w:p>
         </w:tc>
@@ -4366,7 +3732,7 @@
               <w:rPr>
                 <w:sz w:val="16"/>
               </w:rPr>
-              <w:t>Feature-set proposal; results not checked.</w:t>
+              <w:t>Ensemble design; split not checked; metrics are accuracy and sensitivity, not macro F1.</w:t>
             </w:r>
           </w:p>
         </w:tc>
@@ -4382,7 +3748,7 @@
               <w:rPr>
                 <w:sz w:val="16"/>
               </w:rPr>
-              <w:t>Setup</w:t>
+              <w:t>C1, C4</w:t>
             </w:r>
           </w:p>
         </w:tc>
@@ -4398,7 +3764,7 @@
               <w:rPr>
                 <w:sz w:val="16"/>
               </w:rPr>
-              <w:t>Background</w:t>
+              <w:t>Partial</w:t>
             </w:r>
           </w:p>
         </w:tc>
@@ -4438,7 +3804,7 @@
               <w:rPr>
                 <w:sz w:val="16"/>
               </w:rPr>
-              <w:t>Zoghi &amp; Serpen 2024</w:t>
+              <w:t>Lo et al. 2022</w:t>
             </w:r>
           </w:p>
         </w:tc>
@@ -4455,7 +3821,7 @@
               <w:rPr>
                 <w:sz w:val="16"/>
               </w:rPr>
-              <w:t>Yes</w:t>
+              <w:t>No (IoT datasets)</w:t>
             </w:r>
           </w:p>
         </w:tc>
@@ -4472,7 +3838,7 @@
               <w:rPr>
                 <w:sz w:val="16"/>
               </w:rPr>
-              <w:t>Binary and multi-class; accuracy and sensitivity</w:t>
+              <w:t>Multi-class, weighted F1</w:t>
             </w:r>
           </w:p>
         </w:tc>
@@ -4489,7 +3855,7 @@
               <w:rPr>
                 <w:sz w:val="16"/>
               </w:rPr>
-              <w:t>Ensemble design; split not checked; metrics are accuracy and sensitivity, not macro F1.</w:t>
+              <w:t>Same graph definition as our GNN (nodes = IP and port, edges = flows). Different data, 70/30 split, full-neighbourhood training, weighted F1. We implemented the design on UNSW-NB15 (see analysis.md, section 8).</w:t>
             </w:r>
           </w:p>
         </w:tc>
@@ -4506,7 +3872,7 @@
               <w:rPr>
                 <w:sz w:val="16"/>
               </w:rPr>
-              <w:t>C1, C4</w:t>
+              <w:t>C5, C6, C9, C11</w:t>
             </w:r>
           </w:p>
         </w:tc>
@@ -4561,7 +3927,7 @@
               <w:rPr>
                 <w:sz w:val="16"/>
               </w:rPr>
-              <w:t>Kasongo &amp; Sun 2020</w:t>
+              <w:t>Caville et al. 2022</w:t>
             </w:r>
           </w:p>
         </w:tc>
@@ -4577,7 +3943,7 @@
               <w:rPr>
                 <w:sz w:val="16"/>
               </w:rPr>
-              <w:t>Yes</w:t>
+              <w:t>NetFlow version</w:t>
             </w:r>
           </w:p>
         </w:tc>
@@ -4593,7 +3959,7 @@
               <w:rPr>
                 <w:sz w:val="16"/>
               </w:rPr>
-              <w:t>Accuracy-style metrics</w:t>
+              <w:t>Binary anomaly detection, macro F1 over normal and attack</w:t>
             </w:r>
           </w:p>
         </w:tc>
@@ -4609,7 +3975,7 @@
               <w:rPr>
                 <w:sz w:val="16"/>
               </w:rPr>
-              <w:t>Feature selection study; split and results not checked.</w:t>
+              <w:t>Self-supervised, attack-free training; not comparable with 10-class macro F1.</w:t>
             </w:r>
           </w:p>
         </w:tc>
@@ -4625,7 +3991,7 @@
               <w:rPr>
                 <w:sz w:val="16"/>
               </w:rPr>
-              <w:t>None yet</w:t>
+              <w:t>C5</w:t>
             </w:r>
           </w:p>
         </w:tc>
@@ -4681,7 +4047,7 @@
               <w:rPr>
                 <w:sz w:val="16"/>
               </w:rPr>
-              <w:t>Lo et al. 2022</w:t>
+              <w:t>Pujol-Perich et al. 2022</w:t>
             </w:r>
           </w:p>
         </w:tc>
@@ -4698,7 +4064,7 @@
               <w:rPr>
                 <w:sz w:val="16"/>
               </w:rPr>
-              <w:t>No (IoT datasets)</w:t>
+              <w:t>No (CIC-IDS2017)</w:t>
             </w:r>
           </w:p>
         </w:tc>
@@ -4732,7 +4098,7 @@
               <w:rPr>
                 <w:sz w:val="16"/>
               </w:rPr>
-              <w:t>Same graph definition as our GNN (nodes = IP and port, edges = flows). Different data, 70/30 split, full-neighbourhood training, weighted F1. We implemented the design on UNSW-NB15 (see analysis.md, section 8).</w:t>
+              <w:t>Host and flow graph, different architecture; robustness study.</w:t>
             </w:r>
           </w:p>
         </w:tc>
@@ -4749,7 +4115,7 @@
               <w:rPr>
                 <w:sz w:val="16"/>
               </w:rPr>
-              <w:t>C5, C6, C9, C11</w:t>
+              <w:t>C5, C6</w:t>
             </w:r>
           </w:p>
         </w:tc>
@@ -4766,7 +4132,7 @@
               <w:rPr>
                 <w:sz w:val="16"/>
               </w:rPr>
-              <w:t>Partial</w:t>
+              <w:t>Background</w:t>
             </w:r>
           </w:p>
         </w:tc>
@@ -4804,7 +4170,7 @@
               <w:rPr>
                 <w:sz w:val="16"/>
               </w:rPr>
-              <w:t>Caville et al. 2022</w:t>
+              <w:t>Wang et al. 2025</w:t>
             </w:r>
           </w:p>
         </w:tc>
@@ -4820,7 +4186,7 @@
               <w:rPr>
                 <w:sz w:val="16"/>
               </w:rPr>
-              <w:t>NetFlow version</w:t>
+              <w:t>No</w:t>
             </w:r>
           </w:p>
         </w:tc>
@@ -4836,7 +4202,7 @@
               <w:rPr>
                 <w:sz w:val="16"/>
               </w:rPr>
-              <w:t>Binary anomaly detection, macro F1 over normal and attack</w:t>
+              <w:t>Detection quality of graph IDS</w:t>
             </w:r>
           </w:p>
         </w:tc>
@@ -4852,7 +4218,7 @@
               <w:rPr>
                 <w:sz w:val="16"/>
               </w:rPr>
-              <w:t>Self-supervised, attack-free training; not comparable with 10-class macro F1.</w:t>
+              <w:t>Mostly host-level and anomaly-based systems, not flow classification.</w:t>
             </w:r>
           </w:p>
         </w:tc>
@@ -4868,7 +4234,7 @@
               <w:rPr>
                 <w:sz w:val="16"/>
               </w:rPr>
-              <w:t>C5</w:t>
+              <w:t>C8, C9</w:t>
             </w:r>
           </w:p>
         </w:tc>
@@ -4884,7 +4250,7 @@
               <w:rPr>
                 <w:sz w:val="16"/>
               </w:rPr>
-              <w:t>Partial</w:t>
+              <w:t>Background</w:t>
             </w:r>
           </w:p>
         </w:tc>
@@ -4924,7 +4290,7 @@
               <w:rPr>
                 <w:sz w:val="16"/>
               </w:rPr>
-              <w:t>Pujol-Perich et al. 2022</w:t>
+              <w:t>Xu et al. 2025</w:t>
             </w:r>
           </w:p>
         </w:tc>
@@ -4941,7 +4307,7 @@
               <w:rPr>
                 <w:sz w:val="16"/>
               </w:rPr>
-              <w:t>No (CIC-IDS2017)</w:t>
+              <w:t>Yes</w:t>
             </w:r>
           </w:p>
         </w:tc>
@@ -4958,7 +4324,7 @@
               <w:rPr>
                 <w:sz w:val="16"/>
               </w:rPr>
-              <w:t>Multi-class, weighted F1</w:t>
+              <w:t>10-class, weighted F1</w:t>
             </w:r>
           </w:p>
         </w:tc>
@@ -4975,7 +4341,7 @@
               <w:rPr>
                 <w:sz w:val="16"/>
               </w:rPr>
-              <w:t>Host and flow graph, different architecture; robustness study.</w:t>
+              <w:t>Weighted F1, which is dominated by Normal and Generic; 5:2:3 split; no tree baseline.</w:t>
             </w:r>
           </w:p>
         </w:tc>
@@ -4992,7 +4358,7 @@
               <w:rPr>
                 <w:sz w:val="16"/>
               </w:rPr>
-              <w:t>C5, C6</w:t>
+              <w:t>C6, C11</w:t>
             </w:r>
           </w:p>
         </w:tc>
@@ -5009,7 +4375,7 @@
               <w:rPr>
                 <w:sz w:val="16"/>
               </w:rPr>
-              <w:t>Background</w:t>
+              <w:t>Partial</w:t>
             </w:r>
           </w:p>
         </w:tc>
@@ -5031,7 +4397,7 @@
                 <w:b/>
                 <w:sz w:val="16"/>
               </w:rPr>
-              <w:t>P9, P10</w:t>
+              <w:t>P9</w:t>
             </w:r>
           </w:p>
         </w:tc>
@@ -5047,7 +4413,7 @@
               <w:rPr>
                 <w:sz w:val="16"/>
               </w:rPr>
-              <w:t>Bilot 2023; Zhong 2024</w:t>
+              <w:t>Mohamed &amp; Taherdoost 2026</w:t>
             </w:r>
           </w:p>
         </w:tc>
@@ -5063,7 +4429,7 @@
               <w:rPr>
                 <w:sz w:val="16"/>
               </w:rPr>
-              <w:t>n/a</w:t>
+              <w:t>Yes</w:t>
             </w:r>
           </w:p>
         </w:tc>
@@ -5079,7 +4445,7 @@
               <w:rPr>
                 <w:sz w:val="16"/>
               </w:rPr>
-              <w:t>n/a</w:t>
+              <w:t>Binary, F1</w:t>
             </w:r>
           </w:p>
         </w:tc>
@@ -5095,7 +4461,7 @@
               <w:rPr>
                 <w:sz w:val="16"/>
               </w:rPr>
-              <w:t>Surveys; we have not extracted their GNN-vs-tree statements.</w:t>
+              <w:t>40,000-flow sample; graph over 47 IP nodes (ours uses IP and port nodes); Random Forest.</w:t>
             </w:r>
           </w:p>
         </w:tc>
@@ -5111,7 +4477,7 @@
               <w:rPr>
                 <w:sz w:val="16"/>
               </w:rPr>
-              <w:t>C5, C6</w:t>
+              <w:t>C7</w:t>
             </w:r>
           </w:p>
         </w:tc>
@@ -5127,7 +4493,7 @@
               <w:rPr>
                 <w:sz w:val="16"/>
               </w:rPr>
-              <w:t>Background</w:t>
+              <w:t>Partial</w:t>
             </w:r>
           </w:p>
         </w:tc>
@@ -5150,7 +4516,7 @@
                 <w:b/>
                 <w:sz w:val="16"/>
               </w:rPr>
-              <w:t>P11</w:t>
+              <w:t>P10</w:t>
             </w:r>
           </w:p>
         </w:tc>
@@ -5167,7 +4533,7 @@
               <w:rPr>
                 <w:sz w:val="16"/>
               </w:rPr>
-              <w:t>Wang et al. 2025</w:t>
+              <w:t>El Mahdaouy et al. 2026</w:t>
             </w:r>
           </w:p>
         </w:tc>
@@ -5184,7 +4550,7 @@
               <w:rPr>
                 <w:sz w:val="16"/>
               </w:rPr>
-              <w:t>No</w:t>
+              <w:t>n/a</w:t>
             </w:r>
           </w:p>
         </w:tc>
@@ -5201,7 +4567,7 @@
               <w:rPr>
                 <w:sz w:val="16"/>
               </w:rPr>
-              <w:t>Detection quality of graph IDS</w:t>
+              <w:t>n/a</w:t>
             </w:r>
           </w:p>
         </w:tc>
@@ -5218,7 +4584,7 @@
               <w:rPr>
                 <w:sz w:val="16"/>
               </w:rPr>
-              <w:t>Mostly host-level and anomaly-based systems, not flow classification.</w:t>
+              <w:t>Survey of context-aware detectors and their evaluation problems.</w:t>
             </w:r>
           </w:p>
         </w:tc>
@@ -5235,7 +4601,7 @@
               <w:rPr>
                 <w:sz w:val="16"/>
               </w:rPr>
-              <w:t>C8, C9</w:t>
+              <w:t>C9</w:t>
             </w:r>
           </w:p>
         </w:tc>
@@ -5274,7 +4640,7 @@
                 <w:b/>
                 <w:sz w:val="16"/>
               </w:rPr>
-              <w:t>P12</w:t>
+              <w:t>P11</w:t>
             </w:r>
           </w:p>
         </w:tc>
@@ -5290,7 +4656,7 @@
               <w:rPr>
                 <w:sz w:val="16"/>
               </w:rPr>
-              <w:t>Xu et al. 2025</w:t>
+              <w:t>Grinsztajn et al. 2022</w:t>
             </w:r>
           </w:p>
         </w:tc>
@@ -5306,7 +4672,7 @@
               <w:rPr>
                 <w:sz w:val="16"/>
               </w:rPr>
-              <w:t>Yes</w:t>
+              <w:t>No</w:t>
             </w:r>
           </w:p>
         </w:tc>
@@ -5322,7 +4688,7 @@
               <w:rPr>
                 <w:sz w:val="16"/>
               </w:rPr>
-              <w:t>10-class, weighted F1</w:t>
+              <w:t>Tabular benchmark</w:t>
             </w:r>
           </w:p>
         </w:tc>
@@ -5338,7 +4704,7 @@
               <w:rPr>
                 <w:sz w:val="16"/>
               </w:rPr>
-              <w:t>Weighted F1, which is dominated by Normal and Generic; 5:2:3 split; no tree baseline.</w:t>
+              <w:t>Their finding is for medium-sized data (about 10,000 samples); our training set has 1.6 million rows.</w:t>
             </w:r>
           </w:p>
         </w:tc>
@@ -5354,7 +4720,7 @@
               <w:rPr>
                 <w:sz w:val="16"/>
               </w:rPr>
-              <w:t>C6, C11</w:t>
+              <w:t>C6</w:t>
             </w:r>
           </w:p>
         </w:tc>
@@ -5370,7 +4736,7 @@
               <w:rPr>
                 <w:sz w:val="16"/>
               </w:rPr>
-              <w:t>Partial</w:t>
+              <w:t>Background</w:t>
             </w:r>
           </w:p>
         </w:tc>
@@ -5393,7 +4759,7 @@
                 <w:b/>
                 <w:sz w:val="16"/>
               </w:rPr>
-              <w:t>P13</w:t>
+              <w:t>P12</w:t>
             </w:r>
           </w:p>
         </w:tc>
@@ -5410,7 +4776,7 @@
               <w:rPr>
                 <w:sz w:val="16"/>
               </w:rPr>
-              <w:t>Mohamed &amp; Taherdoost 2026</w:t>
+              <w:t>Elor &amp; Averbuch-Elor 2022</w:t>
             </w:r>
           </w:p>
         </w:tc>
@@ -5427,7 +4793,7 @@
               <w:rPr>
                 <w:sz w:val="16"/>
               </w:rPr>
-              <w:t>Yes</w:t>
+              <w:t>No</w:t>
             </w:r>
           </w:p>
         </w:tc>
@@ -5444,7 +4810,7 @@
               <w:rPr>
                 <w:sz w:val="16"/>
               </w:rPr>
-              <w:t>Binary, F1</w:t>
+              <w:t>Binary imbalanced tabular</w:t>
             </w:r>
           </w:p>
         </w:tc>
@@ -5461,7 +4827,7 @@
               <w:rPr>
                 <w:sz w:val="16"/>
               </w:rPr>
-              <w:t>40,000-flow sample; graph over 47 IP nodes (ours uses IP and port nodes); Random Forest.</w:t>
+              <w:t>Studies resampling, not class weights; binary only.</w:t>
             </w:r>
           </w:p>
         </w:tc>
@@ -5478,7 +4844,7 @@
               <w:rPr>
                 <w:sz w:val="16"/>
               </w:rPr>
-              <w:t>C7</w:t>
+              <w:t>C3</w:t>
             </w:r>
           </w:p>
         </w:tc>
@@ -5495,7 +4861,7 @@
               <w:rPr>
                 <w:sz w:val="16"/>
               </w:rPr>
-              <w:t>Partial</w:t>
+              <w:t>Background</w:t>
             </w:r>
           </w:p>
         </w:tc>
@@ -5517,7 +4883,7 @@
                 <w:b/>
                 <w:sz w:val="16"/>
               </w:rPr>
-              <w:t>P14</w:t>
+              <w:t>P13</w:t>
             </w:r>
           </w:p>
         </w:tc>
@@ -5533,7 +4899,7 @@
               <w:rPr>
                 <w:sz w:val="16"/>
               </w:rPr>
-              <w:t>El Mahdaouy et al. 2026</w:t>
+              <w:t>Engelen et al. 2021</w:t>
             </w:r>
           </w:p>
         </w:tc>
@@ -5549,7 +4915,7 @@
               <w:rPr>
                 <w:sz w:val="16"/>
               </w:rPr>
-              <w:t>n/a</w:t>
+              <w:t>No (CICIDS2017)</w:t>
             </w:r>
           </w:p>
         </w:tc>
@@ -5565,7 +4931,7 @@
               <w:rPr>
                 <w:sz w:val="16"/>
               </w:rPr>
-              <w:t>n/a</w:t>
+              <w:t>Dataset audit</w:t>
             </w:r>
           </w:p>
         </w:tc>
@@ -5581,7 +4947,7 @@
               <w:rPr>
                 <w:sz w:val="16"/>
               </w:rPr>
-              <w:t>Survey of context-aware detectors and their evaluation problems.</w:t>
+              <w:t>Different dataset.</w:t>
             </w:r>
           </w:p>
         </w:tc>
@@ -5597,7 +4963,7 @@
               <w:rPr>
                 <w:sz w:val="16"/>
               </w:rPr>
-              <w:t>C9</w:t>
+              <w:t>C4</w:t>
             </w:r>
           </w:p>
         </w:tc>
@@ -5636,7 +5002,7 @@
                 <w:b/>
                 <w:sz w:val="16"/>
               </w:rPr>
-              <w:t>P15</w:t>
+              <w:t>P14</w:t>
             </w:r>
           </w:p>
         </w:tc>
@@ -5653,7 +5019,7 @@
               <w:rPr>
                 <w:sz w:val="16"/>
               </w:rPr>
-              <w:t>Grinsztajn et al. 2022</w:t>
+              <w:t>Northcutt et al. 2021</w:t>
             </w:r>
           </w:p>
         </w:tc>
@@ -5687,7 +5053,7 @@
               <w:rPr>
                 <w:sz w:val="16"/>
               </w:rPr>
-              <w:t>Tabular benchmark</w:t>
+              <w:t>Label errors in general</w:t>
             </w:r>
           </w:p>
         </w:tc>
@@ -5704,7 +5070,7 @@
               <w:rPr>
                 <w:sz w:val="16"/>
               </w:rPr>
-              <w:t>Their finding is for medium-sized data (about 10,000 samples); our training set has 1.6 million rows.</w:t>
+              <w:t>No intrusion data.</w:t>
             </w:r>
           </w:p>
         </w:tc>
@@ -5721,7 +5087,7 @@
               <w:rPr>
                 <w:sz w:val="16"/>
               </w:rPr>
-              <w:t>C6</w:t>
+              <w:t>C4</w:t>
             </w:r>
           </w:p>
         </w:tc>
@@ -5729,367 +5095,6 @@
           <w:tcPr>
             <w:tcW w:type="dxa" w:w="1247"/>
             <w:shd w:val="clear" w:color="auto" w:fill="F2F5F9"/>
-          </w:tcPr>
-          <w:p>
-            <w:pPr>
-              <w:spacing w:after="0"/>
-            </w:pPr>
-            <w:r>
-              <w:rPr>
-                <w:sz w:val="16"/>
-              </w:rPr>
-              <w:t>Background</w:t>
-            </w:r>
-          </w:p>
-        </w:tc>
-      </w:tr>
-      <w:tr>
-        <w:trPr>
-          <w:cantSplit w:val="true"/>
-        </w:trPr>
-        <w:tc>
-          <w:tcPr>
-            <w:tcW w:type="dxa" w:w="794"/>
-          </w:tcPr>
-          <w:p>
-            <w:pPr>
-              <w:spacing w:after="0"/>
-            </w:pPr>
-            <w:r>
-              <w:rPr>
-                <w:b/>
-                <w:sz w:val="16"/>
-              </w:rPr>
-              <w:t>P16</w:t>
-            </w:r>
-          </w:p>
-        </w:tc>
-        <w:tc>
-          <w:tcPr>
-            <w:tcW w:type="dxa" w:w="2041"/>
-          </w:tcPr>
-          <w:p>
-            <w:pPr>
-              <w:spacing w:after="0"/>
-            </w:pPr>
-            <w:r>
-              <w:rPr>
-                <w:sz w:val="16"/>
-              </w:rPr>
-              <w:t>Elor &amp; Averbuch-Elor 2022</w:t>
-            </w:r>
-          </w:p>
-        </w:tc>
-        <w:tc>
-          <w:tcPr>
-            <w:tcW w:type="dxa" w:w="1474"/>
-          </w:tcPr>
-          <w:p>
-            <w:pPr>
-              <w:spacing w:after="0"/>
-            </w:pPr>
-            <w:r>
-              <w:rPr>
-                <w:sz w:val="16"/>
-              </w:rPr>
-              <w:t>No</w:t>
-            </w:r>
-          </w:p>
-        </w:tc>
-        <w:tc>
-          <w:tcPr>
-            <w:tcW w:type="dxa" w:w="2154"/>
-          </w:tcPr>
-          <w:p>
-            <w:pPr>
-              <w:spacing w:after="0"/>
-            </w:pPr>
-            <w:r>
-              <w:rPr>
-                <w:sz w:val="16"/>
-              </w:rPr>
-              <w:t>Binary imbalanced tabular</w:t>
-            </w:r>
-          </w:p>
-        </w:tc>
-        <w:tc>
-          <w:tcPr>
-            <w:tcW w:type="dxa" w:w="5102"/>
-          </w:tcPr>
-          <w:p>
-            <w:pPr>
-              <w:spacing w:after="0"/>
-            </w:pPr>
-            <w:r>
-              <w:rPr>
-                <w:sz w:val="16"/>
-              </w:rPr>
-              <w:t>Studies resampling, not class weights; binary only.</w:t>
-            </w:r>
-          </w:p>
-        </w:tc>
-        <w:tc>
-          <w:tcPr>
-            <w:tcW w:type="dxa" w:w="1474"/>
-          </w:tcPr>
-          <w:p>
-            <w:pPr>
-              <w:spacing w:after="0"/>
-            </w:pPr>
-            <w:r>
-              <w:rPr>
-                <w:sz w:val="16"/>
-              </w:rPr>
-              <w:t>C3</w:t>
-            </w:r>
-          </w:p>
-        </w:tc>
-        <w:tc>
-          <w:tcPr>
-            <w:tcW w:type="dxa" w:w="1247"/>
-          </w:tcPr>
-          <w:p>
-            <w:pPr>
-              <w:spacing w:after="0"/>
-            </w:pPr>
-            <w:r>
-              <w:rPr>
-                <w:sz w:val="16"/>
-              </w:rPr>
-              <w:t>Background</w:t>
-            </w:r>
-          </w:p>
-        </w:tc>
-      </w:tr>
-      <w:tr>
-        <w:trPr>
-          <w:cantSplit w:val="true"/>
-        </w:trPr>
-        <w:tc>
-          <w:tcPr>
-            <w:tcW w:type="dxa" w:w="794"/>
-            <w:shd w:val="clear" w:color="auto" w:fill="F2F5F9"/>
-          </w:tcPr>
-          <w:p>
-            <w:pPr>
-              <w:spacing w:after="0"/>
-            </w:pPr>
-            <w:r>
-              <w:rPr>
-                <w:b/>
-                <w:sz w:val="16"/>
-              </w:rPr>
-              <w:t>P17</w:t>
-            </w:r>
-          </w:p>
-        </w:tc>
-        <w:tc>
-          <w:tcPr>
-            <w:tcW w:type="dxa" w:w="2041"/>
-            <w:shd w:val="clear" w:color="auto" w:fill="F2F5F9"/>
-          </w:tcPr>
-          <w:p>
-            <w:pPr>
-              <w:spacing w:after="0"/>
-            </w:pPr>
-            <w:r>
-              <w:rPr>
-                <w:sz w:val="16"/>
-              </w:rPr>
-              <w:t>Engelen et al. 2021</w:t>
-            </w:r>
-          </w:p>
-        </w:tc>
-        <w:tc>
-          <w:tcPr>
-            <w:tcW w:type="dxa" w:w="1474"/>
-            <w:shd w:val="clear" w:color="auto" w:fill="F2F5F9"/>
-          </w:tcPr>
-          <w:p>
-            <w:pPr>
-              <w:spacing w:after="0"/>
-            </w:pPr>
-            <w:r>
-              <w:rPr>
-                <w:sz w:val="16"/>
-              </w:rPr>
-              <w:t>No (CICIDS2017)</w:t>
-            </w:r>
-          </w:p>
-        </w:tc>
-        <w:tc>
-          <w:tcPr>
-            <w:tcW w:type="dxa" w:w="2154"/>
-            <w:shd w:val="clear" w:color="auto" w:fill="F2F5F9"/>
-          </w:tcPr>
-          <w:p>
-            <w:pPr>
-              <w:spacing w:after="0"/>
-            </w:pPr>
-            <w:r>
-              <w:rPr>
-                <w:sz w:val="16"/>
-              </w:rPr>
-              <w:t>Dataset audit</w:t>
-            </w:r>
-          </w:p>
-        </w:tc>
-        <w:tc>
-          <w:tcPr>
-            <w:tcW w:type="dxa" w:w="5102"/>
-            <w:shd w:val="clear" w:color="auto" w:fill="F2F5F9"/>
-          </w:tcPr>
-          <w:p>
-            <w:pPr>
-              <w:spacing w:after="0"/>
-            </w:pPr>
-            <w:r>
-              <w:rPr>
-                <w:sz w:val="16"/>
-              </w:rPr>
-              <w:t>Different dataset.</w:t>
-            </w:r>
-          </w:p>
-        </w:tc>
-        <w:tc>
-          <w:tcPr>
-            <w:tcW w:type="dxa" w:w="1474"/>
-            <w:shd w:val="clear" w:color="auto" w:fill="F2F5F9"/>
-          </w:tcPr>
-          <w:p>
-            <w:pPr>
-              <w:spacing w:after="0"/>
-            </w:pPr>
-            <w:r>
-              <w:rPr>
-                <w:sz w:val="16"/>
-              </w:rPr>
-              <w:t>C4</w:t>
-            </w:r>
-          </w:p>
-        </w:tc>
-        <w:tc>
-          <w:tcPr>
-            <w:tcW w:type="dxa" w:w="1247"/>
-            <w:shd w:val="clear" w:color="auto" w:fill="F2F5F9"/>
-          </w:tcPr>
-          <w:p>
-            <w:pPr>
-              <w:spacing w:after="0"/>
-            </w:pPr>
-            <w:r>
-              <w:rPr>
-                <w:sz w:val="16"/>
-              </w:rPr>
-              <w:t>Background</w:t>
-            </w:r>
-          </w:p>
-        </w:tc>
-      </w:tr>
-      <w:tr>
-        <w:trPr>
-          <w:cantSplit w:val="true"/>
-        </w:trPr>
-        <w:tc>
-          <w:tcPr>
-            <w:tcW w:type="dxa" w:w="794"/>
-          </w:tcPr>
-          <w:p>
-            <w:pPr>
-              <w:spacing w:after="0"/>
-            </w:pPr>
-            <w:r>
-              <w:rPr>
-                <w:b/>
-                <w:sz w:val="16"/>
-              </w:rPr>
-              <w:t>P18</w:t>
-            </w:r>
-          </w:p>
-        </w:tc>
-        <w:tc>
-          <w:tcPr>
-            <w:tcW w:type="dxa" w:w="2041"/>
-          </w:tcPr>
-          <w:p>
-            <w:pPr>
-              <w:spacing w:after="0"/>
-            </w:pPr>
-            <w:r>
-              <w:rPr>
-                <w:sz w:val="16"/>
-              </w:rPr>
-              <w:t>Northcutt et al. 2021</w:t>
-            </w:r>
-          </w:p>
-        </w:tc>
-        <w:tc>
-          <w:tcPr>
-            <w:tcW w:type="dxa" w:w="1474"/>
-          </w:tcPr>
-          <w:p>
-            <w:pPr>
-              <w:spacing w:after="0"/>
-            </w:pPr>
-            <w:r>
-              <w:rPr>
-                <w:sz w:val="16"/>
-              </w:rPr>
-              <w:t>No</w:t>
-            </w:r>
-          </w:p>
-        </w:tc>
-        <w:tc>
-          <w:tcPr>
-            <w:tcW w:type="dxa" w:w="2154"/>
-          </w:tcPr>
-          <w:p>
-            <w:pPr>
-              <w:spacing w:after="0"/>
-            </w:pPr>
-            <w:r>
-              <w:rPr>
-                <w:sz w:val="16"/>
-              </w:rPr>
-              <w:t>Label errors in general</w:t>
-            </w:r>
-          </w:p>
-        </w:tc>
-        <w:tc>
-          <w:tcPr>
-            <w:tcW w:type="dxa" w:w="5102"/>
-          </w:tcPr>
-          <w:p>
-            <w:pPr>
-              <w:spacing w:after="0"/>
-            </w:pPr>
-            <w:r>
-              <w:rPr>
-                <w:sz w:val="16"/>
-              </w:rPr>
-              <w:t>No intrusion data.</w:t>
-            </w:r>
-          </w:p>
-        </w:tc>
-        <w:tc>
-          <w:tcPr>
-            <w:tcW w:type="dxa" w:w="1474"/>
-          </w:tcPr>
-          <w:p>
-            <w:pPr>
-              <w:spacing w:after="0"/>
-            </w:pPr>
-            <w:r>
-              <w:rPr>
-                <w:sz w:val="16"/>
-              </w:rPr>
-              <w:t>C4</w:t>
-            </w:r>
-          </w:p>
-        </w:tc>
-        <w:tc>
-          <w:tcPr>
-            <w:tcW w:type="dxa" w:w="1247"/>
           </w:tcPr>
           <w:p>
             <w:pPr>
@@ -6262,7 +5267,7 @@
               <w:rPr>
                 <w:sz w:val="16"/>
               </w:rPr>
-              <w:t>P2, P4, P16</w:t>
+              <w:t>P2, P3, P12</w:t>
             </w:r>
           </w:p>
         </w:tc>
@@ -6278,7 +5283,7 @@
               <w:rPr>
                 <w:sz w:val="16"/>
               </w:rPr>
-              <w:t>P2 used class weights for its Extra Trees but did not report their effect. P4 targets imbalance with Balanced Bagging and a Hellinger-based forest (abstract only). P16 finds that resampling does not help strong classifiers.</w:t>
+              <w:t>P2 used class weights for its Extra Trees but did not report their effect. P3 targets imbalance with Balanced Bagging and a Hellinger-based forest (abstract only). P12 finds that resampling does not help strong classifiers.</w:t>
             </w:r>
           </w:p>
         </w:tc>
@@ -6311,7 +5316,7 @@
               <w:rPr>
                 <w:sz w:val="16"/>
               </w:rPr>
-              <w:t>We found no paper that measures the weighted vs unweighted gap on UNSW-NB15. P16 is about resampling, not weights.</w:t>
+              <w:t>We found no paper that measures the weighted vs unweighted gap on UNSW-NB15. P12 is about resampling, not weights.</w:t>
             </w:r>
           </w:p>
         </w:tc>
@@ -6351,7 +5356,7 @@
               <w:rPr>
                 <w:sz w:val="16"/>
               </w:rPr>
-              <w:t>P4</w:t>
+              <w:t>P3</w:t>
             </w:r>
           </w:p>
         </w:tc>
@@ -6368,7 +5373,7 @@
               <w:rPr>
                 <w:sz w:val="16"/>
               </w:rPr>
-              <w:t>P4 builds an ensemble for imbalance, which is a different design.</w:t>
+              <w:t>P3 builds an ensemble for imbalance, which is a different design.</w:t>
             </w:r>
           </w:p>
         </w:tc>
@@ -6441,7 +5446,7 @@
               <w:rPr>
                 <w:sz w:val="16"/>
               </w:rPr>
-              <w:t>P16</w:t>
+              <w:t>P12</w:t>
             </w:r>
           </w:p>
         </w:tc>
@@ -6457,7 +5462,7 @@
               <w:rPr>
                 <w:sz w:val="16"/>
               </w:rPr>
-              <w:t>P16 reports that balancing, including synthetic samples, does not improve strong classifiers.</w:t>
+              <w:t>P12 reports that balancing, including synthetic samples, does not improve strong classifiers.</w:t>
             </w:r>
           </w:p>
         </w:tc>
@@ -6490,7 +5495,7 @@
               <w:rPr>
                 <w:sz w:val="16"/>
               </w:rPr>
-              <w:t>P16 uses binary tabular data. Our result is on one split and one SMOTE setup, with a gain of 0.011 to 0.015.</w:t>
+              <w:t>P12 uses binary tabular data. Our result is on one split and one SMOTE setup, with a gain of 0.011 to 0.015.</w:t>
             </w:r>
           </w:p>
         </w:tc>
@@ -6513,7 +5518,7 @@
                 <w:b/>
                 <w:sz w:val="16"/>
               </w:rPr>
-              <w:t>C4 Analysis and Backdoor are limited by overlapping labels</w:t>
+              <w:t>C4 Analysis and Backdoor are partly limited by overlapping labels</w:t>
             </w:r>
           </w:p>
         </w:tc>
@@ -6530,7 +5535,7 @@
               <w:rPr>
                 <w:sz w:val="16"/>
               </w:rPr>
-              <w:t>P2, P4, P17, P18</w:t>
+              <w:t>P2, P3, P13, P14</w:t>
             </w:r>
           </w:p>
         </w:tc>
@@ -6547,7 +5552,7 @@
               <w:rPr>
                 <w:sz w:val="16"/>
               </w:rPr>
-              <w:t>P2: Analysis F1 0.03, Backdoor 0.08, DoS 0.18 with a different classifier. P4 names class overlap and imbalance as the problem for UNSW-NB15 (abstract). P17 and P18 show label problems in other data.</w:t>
+              <w:t>P2: Analysis F1 0.03, Backdoor 0.08, DoS 0.18 with a different classifier. P3 names class overlap and imbalance as the problem for UNSW-NB15 (abstract). P13 and P14 show label problems in other data.</w:t>
             </w:r>
           </w:p>
         </w:tc>
@@ -6620,7 +5625,7 @@
               <w:rPr>
                 <w:sz w:val="16"/>
               </w:rPr>
-              <w:t>P6, P7, P8</w:t>
+              <w:t>P4, P5, P6</w:t>
             </w:r>
           </w:p>
         </w:tc>
@@ -6636,7 +5641,7 @@
               <w:rPr>
                 <w:sz w:val="16"/>
               </w:rPr>
-              <w:t>P6 and P7 report graph models on other data; P8 compares a graph model with ML baselines on CIC-IDS2017.</w:t>
+              <w:t>P4 and P5 report graph models on other data; P6 compares a graph model with ML baselines on CIC-IDS2017.</w:t>
             </w:r>
           </w:p>
         </w:tc>
@@ -6669,7 +5674,7 @@
               <w:rPr>
                 <w:sz w:val="16"/>
               </w:rPr>
-              <w:t>We did not find a no-graph or shuffled-graph control in P6, P7 or P8 as read. Their baselines are other classifiers, not the same model without the graph. When we ran that control ourselves, a paper-style E-GraphSAGE showed no gain from the real graph (-0.008 to -0.010 macro F1), while our first GNN showed +0.017, so the answer depends on the design.</w:t>
+              <w:t>We did not find a no-graph or shuffled-graph control in P4, P5 or P6 as read. Their baselines are other classifiers, not the same model without the graph. When we ran that control ourselves, a paper-style E-GraphSAGE showed no gain from the real graph (-0.008 to -0.010 macro F1), while our first GNN showed +0.017, so the answer depends on the design.</w:t>
             </w:r>
           </w:p>
         </w:tc>
@@ -6709,7 +5714,7 @@
               <w:rPr>
                 <w:sz w:val="16"/>
               </w:rPr>
-              <w:t>P6, P12, P15</w:t>
+              <w:t>P4, P8, P11</w:t>
             </w:r>
           </w:p>
         </w:tc>
@@ -6726,7 +5731,7 @@
               <w:rPr>
                 <w:sz w:val="16"/>
               </w:rPr>
-              <w:t>P6 reports weighted F1 equal to or slightly above Extra Trees numbers copied from P2 on NF-BoT-IoT (0.81 vs 0.77), ToN-IoT (0.87 vs 0.87) and NF-ToN-IoT (0.63 vs 0.60). P12 has no tree baseline. P15 finds trees ahead of neural networks on medium-sized tabular data.</w:t>
+              <w:t>P4 reports weighted F1 equal to or slightly above Extra Trees numbers copied from P2 on NF-BoT-IoT (0.81 vs 0.77), ToN-IoT (0.87 vs 0.87) and NF-ToN-IoT (0.63 vs 0.60). P8 has no tree baseline. P11 finds trees ahead of neural networks on medium-sized tabular data.</w:t>
             </w:r>
           </w:p>
         </w:tc>
@@ -6761,7 +5766,7 @@
               <w:rPr>
                 <w:sz w:val="16"/>
               </w:rPr>
-              <w:t>P6 suggests GNN is level with trees on IoT data under weighted F1; P15 points the other way but for smaller data. Different metrics and datasets, so neither settles it. On UNSW-NB15 under macro F1 our trees are 0.07 to 0.08 ahead; under weighted F1 the difference is at most 0.003.</w:t>
+              <w:t>P4 suggests GNN is level with trees on IoT data under weighted F1; P11 points the other way but for smaller data. Different metrics and datasets, so neither settles it. On UNSW-NB15 under macro F1 our trees are 0.07 to 0.08 ahead; under weighted F1 the difference is at most 0.003.</w:t>
             </w:r>
           </w:p>
         </w:tc>
@@ -6799,7 +5804,7 @@
               <w:rPr>
                 <w:sz w:val="16"/>
               </w:rPr>
-              <w:t>P13</w:t>
+              <w:t>P9</w:t>
             </w:r>
           </w:p>
         </w:tc>
@@ -6815,7 +5820,7 @@
               <w:rPr>
                 <w:sz w:val="16"/>
               </w:rPr>
-              <w:t>P13: hybrid F1 97.69% vs flow-only 97.49%; McNemar p = 0.295; paired t-test across folds p = 0.026. The authors withdrew a larger claim after restricting graph statistics to training data.</w:t>
+              <w:t>P9: hybrid F1 97.69% vs flow-only 97.49%; McNemar p = 0.295; paired t-test across folds p = 0.026. The authors withdrew a larger claim after restricting graph statistics to training data.</w:t>
             </w:r>
           </w:p>
         </w:tc>
@@ -6848,7 +5853,7 @@
               <w:rPr>
                 <w:sz w:val="16"/>
               </w:rPr>
-              <w:t>P13 is binary, uses a 40,000-flow sample and a graph of 47 IP nodes.</w:t>
+              <w:t>P9 is binary, uses a 40,000-flow sample and a graph of 47 IP nodes.</w:t>
             </w:r>
           </w:p>
         </w:tc>
@@ -6888,7 +5893,7 @@
               <w:rPr>
                 <w:sz w:val="16"/>
               </w:rPr>
-              <w:t>P2, P11, P14</w:t>
+              <w:t>P2, P7, P10</w:t>
             </w:r>
           </w:p>
         </w:tc>
@@ -6905,7 +5910,7 @@
               <w:rPr>
                 <w:sz w:val="16"/>
               </w:rPr>
-              <w:t>P2 reports Worms F1 0.09 on UNSW-NB15 but 0.55 on the NetFlow version. P11 shows reported metrics shift with thresholds and settings. P14 lists data splitting and leakage as common failure modes.</w:t>
+              <w:t>P2 reports Worms F1 0.09 on UNSW-NB15 but 0.55 on the NetFlow version. P7 shows reported metrics shift with thresholds and settings. P10 lists data splitting and leakage as common failure modes.</w:t>
             </w:r>
           </w:p>
         </w:tc>
@@ -6978,7 +5983,7 @@
               <w:rPr>
                 <w:sz w:val="16"/>
               </w:rPr>
-              <w:t>P14</w:t>
+              <w:t>P10</w:t>
             </w:r>
           </w:p>
         </w:tc>
@@ -6994,7 +5999,7 @@
               <w:rPr>
                 <w:sz w:val="16"/>
               </w:rPr>
-              <w:t>P14 lists evaluation failure modes in general (leakage, data splitting, dataset design).</w:t>
+              <w:t>P10 lists evaluation failure modes in general (leakage, data splitting, dataset design).</w:t>
             </w:r>
           </w:p>
         </w:tc>
@@ -7157,7 +6162,7 @@
               <w:rPr>
                 <w:sz w:val="16"/>
               </w:rPr>
-              <w:t>P2, P6, P12</w:t>
+              <w:t>P2, P4, P8</w:t>
             </w:r>
           </w:p>
         </w:tc>
@@ -7173,7 +6178,7 @@
               <w:rPr>
                 <w:sz w:val="16"/>
               </w:rPr>
-              <w:t>P2 reports weighted-average F1 0.98 on UNSW-NB15 while Analysis and Backdoor have F1 0.03 and 0.08. P6 and P12 report weighted F1 only (P12: 0.8934 to 0.9512 on UNSW-NB15).</w:t>
+              <w:t>P2 reports weighted-average F1 0.98 on UNSW-NB15 while Analysis and Backdoor have F1 0.03 and 0.08. P4 and P8 report weighted F1 only (P8: 0.8934 to 0.9512 on UNSW-NB15).</w:t>
             </w:r>
           </w:p>
         </w:tc>
@@ -7206,7 +6211,7 @@
               <w:rPr>
                 <w:sz w:val="16"/>
               </w:rPr>
-              <w:t>P2's own table shows the same effect for a tree model. The GNN papers' scores may hide per-class failures, but we have not seen their per-class UNSW-NB15 results.</w:t>
+              <w:t>P2's own table shows the same effect for a tree model. The GNN papers' scores may hide per-class failures, but we have not seen their per-class UNSW-NB15 results. P5 (Anomal-E) reports macro F1, but for attack-vs-normal detection.</w:t>
             </w:r>
           </w:p>
         </w:tc>
@@ -8201,7 +7206,7 @@
         <w:spacing w:after="40"/>
       </w:pPr>
       <w:r>
-        <w:t>A flow-GNN paper that runs its own no-graph or shuffled-edge control (P6, P7 and P8 compare against other classifiers instead). We ran this control ourselves on UNSW-NB15 for two GNN designs.</w:t>
+        <w:t>A flow-GNN paper that runs its own no-graph or shuffled-edge control (P4, P5 and P6 compare against other classifiers instead). We ran this control ourselves on UNSW-NB15 for two GNN designs.</w:t>
       </w:r>
     </w:p>
     <w:p>
@@ -8249,7 +7254,7 @@
         <w:spacing w:after="40"/>
       </w:pPr>
       <w:r>
-        <w:t>Open the full text of every paper marked 'Abstract only' (P1, P3 to P5, P9, P10, P14 to P18) and confirm the details marked 'not checked'.</w:t>
+        <w:t>Open the full text of every paper marked 'Abstract only' (P1, P3, P10 to P14) and confirm the details marked 'not checked'.</w:t>
       </w:r>
     </w:p>
     <w:p>
@@ -8258,7 +7263,7 @@
         <w:spacing w:after="40"/>
       </w:pPr>
       <w:r>
-        <w:t>Open the journal versions of P6 and P7, since we read the arXiv versions.</w:t>
+        <w:t>Open the journal versions of P4 and P5, since we read the arXiv versions.</w:t>
       </w:r>
     </w:p>
     <w:p>
@@ -8267,7 +7272,7 @@
         <w:spacing w:after="40"/>
       </w:pPr>
       <w:r>
-        <w:t>Check whether P12 (a preprint) has been published, and whether its UNSW-NB15 split is described in enough detail to reproduce.</w:t>
+        <w:t>Check whether P8 (a preprint) has been published, and whether its UNSW-NB15 split is described in enough detail to reproduce.</w:t>
       </w:r>
     </w:p>
     <w:p>
@@ -8285,7 +7290,7 @@
         <w:spacing w:after="40"/>
       </w:pPr>
       <w:r>
-        <w:t>Optional like-for-like check: compute weighted F1 from our saved predictions, so that our results can be set beside P6 and P12, which report weighted F1.</w:t>
+        <w:t>Optional like-for-like check: compute weighted F1 from our saved predictions, so that our results can be set beside P4 and P8, which report weighted F1.</w:t>
       </w:r>
     </w:p>
     <w:p>
@@ -8293,63 +7298,7 @@
         <w:pStyle w:val="Heading1"/>
       </w:pPr>
       <w:r>
-        <w:t>8. Suggested wording for the report</w:t>
-      </w:r>
-    </w:p>
-    <w:p>
-      <w:pPr>
-        <w:spacing w:after="40"/>
-      </w:pPr>
-      <w:r>
-        <w:rPr>
-          <w:b w:val="0"/>
-          <w:i w:val="0"/>
-        </w:rPr>
-        <w:t>Examples that stay within what the table supports:</w:t>
-      </w:r>
-    </w:p>
-    <w:p>
-      <w:pPr>
-        <w:pStyle w:val="ListBullet"/>
-        <w:spacing w:after="40"/>
-      </w:pPr>
-      <w:r>
-        <w:t>"The per-class pattern we see, with Analysis and Backdoor lowest, also appears in the per-class results of Sarhan et al., who used a different classifier and feature set. We read this as a sign that the difficulty is not specific to our pipeline."</w:t>
-      </w:r>
-    </w:p>
-    <w:p>
-      <w:pPr>
-        <w:pStyle w:val="ListBullet"/>
-        <w:spacing w:after="40"/>
-      </w:pPr>
-      <w:r>
-        <w:t>"We did not find earlier work that reports a no-graph control for a flow-level GNN on this dataset, so we cannot say whether our small graph gain (+0.017 macro F1) is typical."</w:t>
-      </w:r>
-    </w:p>
-    <w:p>
-      <w:pPr>
-        <w:pStyle w:val="ListBullet"/>
-        <w:spacing w:after="40"/>
-      </w:pPr>
-      <w:r>
-        <w:t>"Mohamed and Taherdoost also found only a small gain from graph-derived features for a Random Forest on UNSW-NB15 once graph statistics were computed from training data only. Their task was binary and their sample smaller, so the two results are consistent in direction, not in size."</w:t>
-      </w:r>
-    </w:p>
-    <w:p>
-      <w:pPr>
-        <w:pStyle w:val="ListBullet"/>
-        <w:spacing w:after="40"/>
-      </w:pPr>
-      <w:r>
-        <w:t>"Published GNN results usually report weighted F1, which Normal and Generic dominate. Our macro F1 values are therefore not directly comparable with those papers."</w:t>
-      </w:r>
-    </w:p>
-    <w:p>
-      <w:pPr>
-        <w:pStyle w:val="Heading1"/>
-      </w:pPr>
-      <w:r>
-        <w:t>9. How to describe our contribution</w:t>
+        <w:t>8. How to describe our contribution</w:t>
       </w:r>
     </w:p>
     <w:p>
@@ -8400,7 +7349,7 @@
         <w:spacing w:after="40"/>
       </w:pPr>
       <w:r>
-        <w:t>Macro and per-class F1 next to weighted F1, which was about 0.98 for every model we trained and so hides the differences.</w:t>
+        <w:t>Macro and per-class F1 next to weighted F1, which was 0.978 to 0.9825 for the paper-style GNN conditions and the best LightGBM model and so hides the differences.</w:t>
       </w:r>
     </w:p>
     <w:p>
@@ -8409,7 +7358,7 @@
         <w:spacing w:after="40"/>
       </w:pPr>
       <w:r>
-        <w:t>Label overlap as a likely reason Analysis and Backdoor stay near F1 0.17 (about 80% of their rows have a feature twin with another label). This fits the pattern but is not proven as the cause.</w:t>
+        <w:t>Label overlap as one reason Analysis and Backdoor stay near F1 0.17 (about 80% of their training rows have a feature twin with another label). It does not explain everything: a rule that memorises the most common label of each identical-feature group reaches only about F1 0.36 on them.</w:t>
       </w:r>
     </w:p>
     <w:p>

</xml_diff>

<commit_message>
Replicate GTCN-G on the paper's own data and test its main ideas
- Identify the paper's data as UNSW-NB15_1.csv (700,001 rows, class mix
  matches its Tables I and II) and add the raw-file row-count notebook
- Show that predicting Normal scores about 0.953 weighted F1 on that mix,
  above the paper's 0.9512, and rerun the baseline on that file (0.993)
- Add a GTCN-G style model with one-part-off ablations, isolated and
  shuffled-neighbour controls, and paired bootstrap intervals
- Add a minority-class loss study (class weights, logit-adjusted loss,
  tuned class scales) and a per-class overlap ceiling (best possible F1
  on the features, in sample)
- Update README, analysis.md (section 13), the report (7.6), the
  literature comparison (C14, C15) and the GTCN-G comparison document
</commit_message>
<xml_diff>
--- a/Our_Work/documents/UNSW-NB15-Literature-Comparison.docx
+++ b/Our_Work/documents/UNSW-NB15-Literature-Comparison.docx
@@ -80,7 +80,7 @@
         <w:spacing w:after="40"/>
       </w:pPr>
       <w:r>
-        <w:t>Table 3 lines our findings (C1 to C13) up against the papers that bear on them.</w:t>
+        <w:t>Table 3 lines our findings (C1 to C15) up against the papers that bear on them.</w:t>
       </w:r>
     </w:p>
     <w:p>
@@ -948,6 +948,117 @@
           </w:p>
         </w:tc>
       </w:tr>
+      <w:tr>
+        <w:trPr>
+          <w:cantSplit w:val="true"/>
+        </w:trPr>
+        <w:tc>
+          <w:tcPr>
+            <w:tcW w:type="dxa" w:w="680"/>
+            <w:shd w:val="clear" w:color="auto" w:fill="F2F5F9"/>
+          </w:tcPr>
+          <w:p>
+            <w:pPr>
+              <w:spacing w:after="0"/>
+            </w:pPr>
+            <w:r>
+              <w:rPr>
+                <w:b/>
+                <w:sz w:val="18"/>
+              </w:rPr>
+              <w:t>C14</w:t>
+            </w:r>
+          </w:p>
+        </w:tc>
+        <w:tc>
+          <w:tcPr>
+            <w:tcW w:type="dxa" w:w="5953"/>
+            <w:shd w:val="clear" w:color="auto" w:fill="F2F5F9"/>
+          </w:tcPr>
+          <w:p>
+            <w:pPr>
+              <w:spacing w:after="0"/>
+            </w:pPr>
+            <w:r>
+              <w:rPr>
+                <w:sz w:val="18"/>
+              </w:rPr>
+              <w:t>The data of P8 matches the first raw UNSW-NB15 file (700,001 flows, same class mix). Predicting Normal for every flow scores about 0.953 weighted F1 on that class mix, above the 0.9512 reported for GTCN-G; our E-GraphSAGE-M style baseline scores 0.993 on that file with duplicates removed.</w:t>
+            </w:r>
+          </w:p>
+        </w:tc>
+        <w:tc>
+          <w:tcPr>
+            <w:tcW w:type="dxa" w:w="8220"/>
+            <w:shd w:val="clear" w:color="auto" w:fill="F2F5F9"/>
+          </w:tcPr>
+          <w:p>
+            <w:pPr>
+              <w:spacing w:after="0"/>
+            </w:pPr>
+            <w:r>
+              <w:rPr>
+                <w:sz w:val="18"/>
+              </w:rPr>
+              <w:t>Rows and class shares of the four raw files agree with P8's Tables I and II for the first file only. Baseline weighted F1 0.9928 ± 0.0002 (3 seeds). The 0.953 is computed from the stated Normal share (96.83%) and assumes the test set has about that class mix.</w:t>
+            </w:r>
+          </w:p>
+        </w:tc>
+      </w:tr>
+      <w:tr>
+        <w:trPr>
+          <w:cantSplit w:val="true"/>
+        </w:trPr>
+        <w:tc>
+          <w:tcPr>
+            <w:tcW w:type="dxa" w:w="680"/>
+          </w:tcPr>
+          <w:p>
+            <w:pPr>
+              <w:spacing w:after="0"/>
+            </w:pPr>
+            <w:r>
+              <w:rPr>
+                <w:b/>
+                <w:sz w:val="18"/>
+              </w:rPr>
+              <w:t>C15</w:t>
+            </w:r>
+          </w:p>
+        </w:tc>
+        <w:tc>
+          <w:tcPr>
+            <w:tcW w:type="dxa" w:w="5953"/>
+          </w:tcPr>
+          <w:p>
+            <w:pPr>
+              <w:spacing w:after="0"/>
+            </w:pPr>
+            <w:r>
+              <w:rPr>
+                <w:sz w:val="18"/>
+              </w:rPr>
+              <w:t>Our GTCN-G style model (own implementation with simplifications) is not better than the simple network on that data. Without its residual branch macro F1 falls by 0.11; attention, temporal and graph convolution branches show no measurable effect; neighbours add about 0.001 weighted F1. Class weights and a logit-adjusted loss did not raise macro F1; 81% to 85% of Analysis and Backdoor flows have an identical-feature twin of another class.</w:t>
+            </w:r>
+          </w:p>
+        </w:tc>
+        <w:tc>
+          <w:tcPr>
+            <w:tcW w:type="dxa" w:w="8220"/>
+          </w:tcPr>
+          <w:p>
+            <w:pPr>
+              <w:spacing w:after="0"/>
+            </w:pPr>
+            <w:r>
+              <w:rPr>
+                <w:sz w:val="18"/>
+              </w:rPr>
+              <w:t>Full 0.9925 / 0.550 against baseline 0.9928 / 0.562 (weighted / macro F1, 3 seeds); full minus no residual +0.108 macro F1 (+0.092 to +0.122); full minus isolated flows +0.0012 weighted F1 (+0.0009 to +0.0015); loss changes -0.030 to +0.013 macro F1.</w:t>
+            </w:r>
+          </w:p>
+        </w:tc>
+      </w:tr>
     </w:tbl>
     <w:p>
       <w:pPr>
@@ -6502,6 +6613,185 @@
                 <w:sz w:val="16"/>
               </w:rPr>
               <w:t>Improved GNN, real graph minus no graph: -0.010 macro F1 (-0.018 to -0.002). Class-weighted LightGBM with class scales tuned on validation: macro F1 0.667.</w:t>
+            </w:r>
+          </w:p>
+        </w:tc>
+      </w:tr>
+      <w:tr>
+        <w:trPr>
+          <w:cantSplit w:val="true"/>
+        </w:trPr>
+        <w:tc>
+          <w:tcPr>
+            <w:tcW w:type="dxa" w:w="2154"/>
+            <w:shd w:val="clear" w:color="auto" w:fill="F2F5F9"/>
+          </w:tcPr>
+          <w:p>
+            <w:pPr>
+              <w:spacing w:after="0"/>
+            </w:pPr>
+            <w:r>
+              <w:rPr>
+                <w:b/>
+                <w:sz w:val="16"/>
+              </w:rPr>
+              <w:t>C14 The data of P8 is the first raw file; predicting Normal scores above P8's GTCN-G value</w:t>
+            </w:r>
+          </w:p>
+        </w:tc>
+        <w:tc>
+          <w:tcPr>
+            <w:tcW w:type="dxa" w:w="1247"/>
+            <w:shd w:val="clear" w:color="auto" w:fill="F2F5F9"/>
+          </w:tcPr>
+          <w:p>
+            <w:pPr>
+              <w:spacing w:after="0"/>
+            </w:pPr>
+            <w:r>
+              <w:rPr>
+                <w:sz w:val="16"/>
+              </w:rPr>
+              <w:t>P8</w:t>
+            </w:r>
+          </w:p>
+        </w:tc>
+        <w:tc>
+          <w:tcPr>
+            <w:tcW w:type="dxa" w:w="4876"/>
+            <w:shd w:val="clear" w:color="auto" w:fill="F2F5F9"/>
+          </w:tcPr>
+          <w:p>
+            <w:pPr>
+              <w:spacing w:after="0"/>
+            </w:pPr>
+            <w:r>
+              <w:rPr>
+                <w:sz w:val="16"/>
+              </w:rPr>
+              <w:t>P8 gives 700,001 examples and 96.83% Normal (Table I) and does not name the file or state its split; its scores are 0.8756 to 0.9512.</w:t>
+            </w:r>
+          </w:p>
+        </w:tc>
+        <w:tc>
+          <w:tcPr>
+            <w:tcW w:type="dxa" w:w="1928"/>
+            <w:shd w:val="clear" w:color="auto" w:fill="F2F5F9"/>
+          </w:tcPr>
+          <w:p>
+            <w:pPr>
+              <w:spacing w:after="0"/>
+            </w:pPr>
+            <w:r>
+              <w:rPr>
+                <w:b/>
+                <w:sz w:val="16"/>
+              </w:rPr>
+              <w:t>Consistent with a weak or undertrained baseline in P8; not shown</w:t>
+            </w:r>
+          </w:p>
+        </w:tc>
+        <w:tc>
+          <w:tcPr>
+            <w:tcW w:type="dxa" w:w="4649"/>
+            <w:shd w:val="clear" w:color="auto" w:fill="F2F5F9"/>
+          </w:tcPr>
+          <w:p>
+            <w:pPr>
+              <w:spacing w:after="0"/>
+            </w:pPr>
+            <w:r>
+              <w:rPr>
+                <w:sz w:val="16"/>
+              </w:rPr>
+              <w:t>The first raw file matches Tables I and II exactly; predicting Normal gives about 0.953 on that class mix; our baseline scores 0.993.</w:t>
+            </w:r>
+          </w:p>
+        </w:tc>
+      </w:tr>
+      <w:tr>
+        <w:trPr>
+          <w:cantSplit w:val="true"/>
+        </w:trPr>
+        <w:tc>
+          <w:tcPr>
+            <w:tcW w:type="dxa" w:w="2154"/>
+          </w:tcPr>
+          <w:p>
+            <w:pPr>
+              <w:spacing w:after="0"/>
+            </w:pPr>
+            <w:r>
+              <w:rPr>
+                <w:b/>
+                <w:sz w:val="16"/>
+              </w:rPr>
+              <w:t>C15 A GTCN-G style model does not beat the simple network; the residual branch matters, attention and temporal branches show no effect</w:t>
+            </w:r>
+          </w:p>
+        </w:tc>
+        <w:tc>
+          <w:tcPr>
+            <w:tcW w:type="dxa" w:w="1247"/>
+          </w:tcPr>
+          <w:p>
+            <w:pPr>
+              <w:spacing w:after="0"/>
+            </w:pPr>
+            <w:r>
+              <w:rPr>
+                <w:sz w:val="16"/>
+              </w:rPr>
+              <w:t>P8</w:t>
+            </w:r>
+          </w:p>
+        </w:tc>
+        <w:tc>
+          <w:tcPr>
+            <w:tcW w:type="dxa" w:w="4876"/>
+          </w:tcPr>
+          <w:p>
+            <w:pPr>
+              <w:spacing w:after="0"/>
+            </w:pPr>
+            <w:r>
+              <w:rPr>
+                <w:sz w:val="16"/>
+              </w:rPr>
+              <w:t>P8 reports GTCN-G above GAT above E-GraphSAGE-M and attributes the gain to attention, temporal fusion and the residual connection.</w:t>
+            </w:r>
+          </w:p>
+        </w:tc>
+        <w:tc>
+          <w:tcPr>
+            <w:tcW w:type="dxa" w:w="1928"/>
+          </w:tcPr>
+          <w:p>
+            <w:pPr>
+              <w:spacing w:after="0"/>
+            </w:pPr>
+            <w:r>
+              <w:rPr>
+                <w:b/>
+                <w:sz w:val="16"/>
+              </w:rPr>
+              <w:t>Not reproduced for our implementation</w:t>
+            </w:r>
+          </w:p>
+        </w:tc>
+        <w:tc>
+          <w:tcPr>
+            <w:tcW w:type="dxa" w:w="4649"/>
+          </w:tcPr>
+          <w:p>
+            <w:pPr>
+              <w:spacing w:after="0"/>
+            </w:pPr>
+            <w:r>
+              <w:rPr>
+                <w:sz w:val="16"/>
+              </w:rPr>
+              <w:t>Our own implementation with simplifications, 3 seeds: full 0.9925 / 0.550 against 0.9928 / 0.562 for the baseline network; no residual branch 0.9899 / 0.439.</w:t>
             </w:r>
           </w:p>
         </w:tc>

</xml_diff>